<commit_message>
Final audit of Part-1 deliverables: fix requirement quality, security and test coverage
- FR-001/FR-002 decomposed into verifiable clauses; new requirements now
  state their Lab 1 basis; security requirements marked Original/Proposed
- Split SEC-REQ-04 into SEC-REQ-04 and SEC-REQ-07; add A-13, A-14
- Add TC-24 (availability/filters) and TC-25 (remove equipment with future
  reservation); suite is now 25 test cases, all Not Executed
- Remove formal IEEE-compliance claims; clarify API justification
- Split UC-03 sequence diagram into two legible parts; larger fonts and
  landscape figure pages; fix component diagram routing
- Rebuild PDF/DOCX, traceability matrix and gap analysis (final audit log)

Co-Authored-By: Claude Sonnet 5.5 <noreply@anthropic.com>
</commit_message>
<xml_diff>
--- a/docs/output/Gap_Analysis.docx
+++ b/docs/output/Gap_Analysis.docx
@@ -325,7 +325,7 @@
               <w:rPr>
                 <w:sz w:val="17"/>
               </w:rPr>
-              <w:t>missing → SRS §4 (4 objectives, 6 requirements)</w:t>
+              <w:t>missing → SRS §4 (4 objectives, 7 requirements)</w:t>
             </w:r>
           </w:p>
         </w:tc>
@@ -392,7 +392,7 @@
               <w:rPr>
                 <w:sz w:val="17"/>
               </w:rPr>
-              <w:t>missing → 23 test cases</w:t>
+              <w:t>missing → 25 test cases</w:t>
             </w:r>
           </w:p>
         </w:tc>
@@ -1333,6 +1333,671 @@
         <w:t>Technology stack; definition of "peak load"; slot granularity / minimum duration; behaviour on notification failure; deletion of equipment with future reservations; whether the due date changes status automatically; deployment security (HTTPS). Each was resolved with a labelled assumption – none is stated as fact – and should be confirmed with the instructor.</w:t>
       </w:r>
     </w:p>
+    <w:p>
+      <w:pPr>
+        <w:pStyle w:val="Heading2"/>
+      </w:pPr>
+      <w:r>
+        <w:rPr/>
+        <w:t>5. Final audit (strict-evaluator pass) – problems found and what was changed</w:t>
+      </w:r>
+    </w:p>
+    <w:tbl>
+      <w:tblPr>
+        <w:tblStyle w:val="TableGrid"/>
+        <w:tblW w:type="auto" w:w="0"/>
+        <w:jc w:val="center"/>
+        <w:tblLook w:firstColumn="1" w:firstRow="1" w:lastColumn="0" w:lastRow="0" w:noHBand="0" w:noVBand="1" w:val="04A0"/>
+      </w:tblPr>
+      <w:tblGrid>
+        <w:gridCol w:w="3312"/>
+        <w:gridCol w:w="3312"/>
+        <w:gridCol w:w="3312"/>
+      </w:tblGrid>
+      <w:tr>
+        <w:tc>
+          <w:tcPr>
+            <w:tcW w:type="dxa" w:w="3312"/>
+            <w:shd w:val="clear" w:color="auto" w:fill="E4EAF6"/>
+          </w:tcPr>
+          <w:p>
+            <w:r>
+              <w:rPr>
+                <w:b/>
+              </w:rPr>
+            </w:r>
+            <w:r>
+              <w:rPr>
+                <w:b/>
+                <w:sz w:val="17"/>
+              </w:rPr>
+              <w:t>#</w:t>
+            </w:r>
+          </w:p>
+        </w:tc>
+        <w:tc>
+          <w:tcPr>
+            <w:tcW w:type="dxa" w:w="3312"/>
+            <w:shd w:val="clear" w:color="auto" w:fill="E4EAF6"/>
+          </w:tcPr>
+          <w:p>
+            <w:r>
+              <w:rPr>
+                <w:b/>
+              </w:rPr>
+            </w:r>
+            <w:r>
+              <w:rPr>
+                <w:b/>
+                <w:sz w:val="17"/>
+              </w:rPr>
+              <w:t>Finding</w:t>
+            </w:r>
+          </w:p>
+        </w:tc>
+        <w:tc>
+          <w:tcPr>
+            <w:tcW w:type="dxa" w:w="3312"/>
+            <w:shd w:val="clear" w:color="auto" w:fill="E4EAF6"/>
+          </w:tcPr>
+          <w:p>
+            <w:r>
+              <w:rPr>
+                <w:b/>
+              </w:rPr>
+            </w:r>
+            <w:r>
+              <w:rPr>
+                <w:b/>
+                <w:sz w:val="17"/>
+              </w:rPr>
+              <w:t>Change</w:t>
+            </w:r>
+          </w:p>
+        </w:tc>
+      </w:tr>
+      <w:tr>
+        <w:tc>
+          <w:tcPr>
+            <w:tcW w:type="dxa" w:w="3312"/>
+          </w:tcPr>
+          <w:p>
+            <w:r/>
+            <w:r>
+              <w:rPr>
+                <w:sz w:val="17"/>
+              </w:rPr>
+              <w:t>1</w:t>
+            </w:r>
+          </w:p>
+        </w:tc>
+        <w:tc>
+          <w:tcPr>
+            <w:tcW w:type="dxa" w:w="3312"/>
+          </w:tcPr>
+          <w:p>
+            <w:r/>
+            <w:r>
+              <w:rPr>
+                <w:sz w:val="17"/>
+              </w:rPr>
+              <w:t>FR-001 and FR-002 bundled several verifiable statements in one sentence (not atomic).</w:t>
+            </w:r>
+          </w:p>
+        </w:tc>
+        <w:tc>
+          <w:tcPr>
+            <w:tcW w:type="dxa" w:w="3312"/>
+          </w:tcPr>
+          <w:p>
+            <w:r/>
+            <w:r>
+              <w:rPr>
+                <w:sz w:val="17"/>
+              </w:rPr>
+              <w:t>Kept the IDs; rewrote them as clauses (a)–(e) and (a)–(c) with a per-clause pass criterion; tests now name the clause they cover.</w:t>
+            </w:r>
+          </w:p>
+        </w:tc>
+      </w:tr>
+      <w:tr>
+        <w:tc>
+          <w:tcPr>
+            <w:tcW w:type="dxa" w:w="3312"/>
+          </w:tcPr>
+          <w:p>
+            <w:r/>
+            <w:r>
+              <w:rPr>
+                <w:sz w:val="17"/>
+              </w:rPr>
+              <w:t>2</w:t>
+            </w:r>
+          </w:p>
+        </w:tc>
+        <w:tc>
+          <w:tcPr>
+            <w:tcW w:type="dxa" w:w="3312"/>
+          </w:tcPr>
+          <w:p>
+            <w:r/>
+            <w:r>
+              <w:rPr>
+                <w:sz w:val="17"/>
+              </w:rPr>
+              <w:t>New requirements FR-006…FR-010, NFR-003 did not state where they came from.</w:t>
+            </w:r>
+          </w:p>
+        </w:tc>
+        <w:tc>
+          <w:tcPr>
+            <w:tcW w:type="dxa" w:w="3312"/>
+          </w:tcPr>
+          <w:p>
+            <w:r/>
+            <w:r>
+              <w:rPr>
+                <w:sz w:val="17"/>
+              </w:rPr>
+              <w:t xml:space="preserve">Added a </w:t>
+            </w:r>
+            <w:r>
+              <w:rPr>
+                <w:i/>
+                <w:sz w:val="17"/>
+              </w:rPr>
+              <w:t>Status / basis</w:t>
+            </w:r>
+            <w:r>
+              <w:rPr>
+                <w:sz w:val="17"/>
+              </w:rPr>
+              <w:t xml:space="preserve"> column naming the Lab 1 source (diagram use case, UC-03 step/precondition, or the split of NFR-001).</w:t>
+            </w:r>
+          </w:p>
+        </w:tc>
+      </w:tr>
+      <w:tr>
+        <w:tc>
+          <w:tcPr>
+            <w:tcW w:type="dxa" w:w="3312"/>
+          </w:tcPr>
+          <w:p>
+            <w:r/>
+            <w:r>
+              <w:rPr>
+                <w:sz w:val="17"/>
+              </w:rPr>
+              <w:t>3</w:t>
+            </w:r>
+          </w:p>
+        </w:tc>
+        <w:tc>
+          <w:tcPr>
+            <w:tcW w:type="dxa" w:w="3312"/>
+          </w:tcPr>
+          <w:p>
+            <w:r/>
+            <w:r>
+              <w:rPr>
+                <w:sz w:val="17"/>
+              </w:rPr>
+              <w:t>Several security requirements were not in Lab 1 and looked invented.</w:t>
+            </w:r>
+          </w:p>
+        </w:tc>
+        <w:tc>
+          <w:tcPr>
+            <w:tcW w:type="dxa" w:w="3312"/>
+          </w:tcPr>
+          <w:p>
+            <w:r/>
+            <w:r>
+              <w:rPr>
+                <w:sz w:val="17"/>
+              </w:rPr>
+              <w:t xml:space="preserve">Added a </w:t>
+            </w:r>
+            <w:r>
+              <w:rPr>
+                <w:i/>
+                <w:sz w:val="17"/>
+              </w:rPr>
+              <w:t>Basis</w:t>
+            </w:r>
+            <w:r>
+              <w:rPr>
+                <w:sz w:val="17"/>
+              </w:rPr>
+              <w:t xml:space="preserve"> column; marked SEC-REQ-03, 05, 06, 07 as </w:t>
+            </w:r>
+            <w:r>
+              <w:rPr>
+                <w:i/>
+                <w:sz w:val="17"/>
+              </w:rPr>
+              <w:t>Proposed</w:t>
+            </w:r>
+            <w:r>
+              <w:rPr>
+                <w:sz w:val="17"/>
+              </w:rPr>
+              <w:t xml:space="preserve"> with the reason; kept only requirements tied to a Lab 1 use case or NFR-002.</w:t>
+            </w:r>
+          </w:p>
+        </w:tc>
+      </w:tr>
+      <w:tr>
+        <w:tc>
+          <w:tcPr>
+            <w:tcW w:type="dxa" w:w="3312"/>
+          </w:tcPr>
+          <w:p>
+            <w:r/>
+            <w:r>
+              <w:rPr>
+                <w:sz w:val="17"/>
+              </w:rPr>
+              <w:t>4</w:t>
+            </w:r>
+          </w:p>
+        </w:tc>
+        <w:tc>
+          <w:tcPr>
+            <w:tcW w:type="dxa" w:w="3312"/>
+          </w:tcPr>
+          <w:p>
+            <w:r/>
+            <w:r>
+              <w:rPr>
+                <w:sz w:val="17"/>
+              </w:rPr>
+              <w:t>SEC-REQ-04 combined three obligations.</w:t>
+            </w:r>
+          </w:p>
+        </w:tc>
+        <w:tc>
+          <w:tcPr>
+            <w:tcW w:type="dxa" w:w="3312"/>
+          </w:tcPr>
+          <w:p>
+            <w:r/>
+            <w:r>
+              <w:rPr>
+                <w:sz w:val="17"/>
+              </w:rPr>
+              <w:t>Split: SEC-REQ-04 (401 without a session) and SEC-REQ-07 (generic login error, no plain-text credentials); tests and matrix updated.</w:t>
+            </w:r>
+          </w:p>
+        </w:tc>
+      </w:tr>
+      <w:tr>
+        <w:tc>
+          <w:tcPr>
+            <w:tcW w:type="dxa" w:w="3312"/>
+          </w:tcPr>
+          <w:p>
+            <w:r/>
+            <w:r>
+              <w:rPr>
+                <w:sz w:val="17"/>
+              </w:rPr>
+              <w:t>5</w:t>
+            </w:r>
+          </w:p>
+        </w:tc>
+        <w:tc>
+          <w:tcPr>
+            <w:tcW w:type="dxa" w:w="3312"/>
+          </w:tcPr>
+          <w:p>
+            <w:r/>
+            <w:r>
+              <w:rPr>
+                <w:sz w:val="17"/>
+              </w:rPr>
+              <w:t>FR-010 read the UC-03 precondition one specific way without saying so.</w:t>
+            </w:r>
+          </w:p>
+        </w:tc>
+        <w:tc>
+          <w:tcPr>
+            <w:tcW w:type="dxa" w:w="3312"/>
+          </w:tcPr>
+          <w:p>
+            <w:r/>
+            <w:r>
+              <w:rPr>
+                <w:sz w:val="17"/>
+              </w:rPr>
+              <w:t>Added assumption A-14 and the condition under which FR-010/TC-15 would be dropped.</w:t>
+            </w:r>
+          </w:p>
+        </w:tc>
+      </w:tr>
+      <w:tr>
+        <w:tc>
+          <w:tcPr>
+            <w:tcW w:type="dxa" w:w="3312"/>
+          </w:tcPr>
+          <w:p>
+            <w:r/>
+            <w:r>
+              <w:rPr>
+                <w:sz w:val="17"/>
+              </w:rPr>
+              <w:t>6</w:t>
+            </w:r>
+          </w:p>
+        </w:tc>
+        <w:tc>
+          <w:tcPr>
+            <w:tcW w:type="dxa" w:w="3312"/>
+          </w:tcPr>
+          <w:p>
+            <w:r/>
+            <w:r>
+              <w:rPr>
+                <w:sz w:val="17"/>
+              </w:rPr>
+              <w:t>"Relational database" was stated as fact; Lab 1 only says "database-level lock isolation".</w:t>
+            </w:r>
+          </w:p>
+        </w:tc>
+        <w:tc>
+          <w:tcPr>
+            <w:tcW w:type="dxa" w:w="3312"/>
+          </w:tcPr>
+          <w:p>
+            <w:r/>
+            <w:r>
+              <w:rPr>
+                <w:sz w:val="17"/>
+              </w:rPr>
+              <w:t>Reworded to "database with transactions and locking (relational assumed – A-13)".</w:t>
+            </w:r>
+          </w:p>
+        </w:tc>
+      </w:tr>
+      <w:tr>
+        <w:tc>
+          <w:tcPr>
+            <w:tcW w:type="dxa" w:w="3312"/>
+          </w:tcPr>
+          <w:p>
+            <w:r/>
+            <w:r>
+              <w:rPr>
+                <w:sz w:val="17"/>
+              </w:rPr>
+              <w:t>7</w:t>
+            </w:r>
+          </w:p>
+        </w:tc>
+        <w:tc>
+          <w:tcPr>
+            <w:tcW w:type="dxa" w:w="3312"/>
+          </w:tcPr>
+          <w:p>
+            <w:r/>
+            <w:r>
+              <w:rPr>
+                <w:sz w:val="17"/>
+              </w:rPr>
+              <w:t>Documents claimed to follow IEEE Std 830/829/1016 formally.</w:t>
+            </w:r>
+          </w:p>
+        </w:tc>
+        <w:tc>
+          <w:tcPr>
+            <w:tcW w:type="dxa" w:w="3312"/>
+          </w:tcPr>
+          <w:p>
+            <w:r/>
+            <w:r>
+              <w:rPr>
+                <w:sz w:val="17"/>
+              </w:rPr>
+              <w:t>Replaced by "IEEE-style structure as requested by the assignment; no formal compliance claimed".</w:t>
+            </w:r>
+          </w:p>
+        </w:tc>
+      </w:tr>
+      <w:tr>
+        <w:tc>
+          <w:tcPr>
+            <w:tcW w:type="dxa" w:w="3312"/>
+          </w:tcPr>
+          <w:p>
+            <w:r/>
+            <w:r>
+              <w:rPr>
+                <w:sz w:val="17"/>
+              </w:rPr>
+              <w:t>8</w:t>
+            </w:r>
+          </w:p>
+        </w:tc>
+        <w:tc>
+          <w:tcPr>
+            <w:tcW w:type="dxa" w:w="3312"/>
+          </w:tcPr>
+          <w:p>
+            <w:r/>
+            <w:r>
+              <w:rPr>
+                <w:sz w:val="17"/>
+              </w:rPr>
+              <w:t>Coverage gaps: availability display / filters (FR-001(a)) and equipment removal with future reservations (A-07) had no dedicated test; test data lacked the accounts needed by TC-16/17 and equipment EQ-05 for TC-05.</w:t>
+            </w:r>
+          </w:p>
+        </w:tc>
+        <w:tc>
+          <w:tcPr>
+            <w:tcW w:type="dxa" w:w="3312"/>
+          </w:tcPr>
+          <w:p>
+            <w:r/>
+            <w:r>
+              <w:rPr>
+                <w:sz w:val="17"/>
+              </w:rPr>
+              <w:t>Added TC-24, TC-25 (suite is now 25); extended test data (§7).</w:t>
+            </w:r>
+          </w:p>
+        </w:tc>
+      </w:tr>
+      <w:tr>
+        <w:tc>
+          <w:tcPr>
+            <w:tcW w:type="dxa" w:w="3312"/>
+          </w:tcPr>
+          <w:p>
+            <w:r/>
+            <w:r>
+              <w:rPr>
+                <w:sz w:val="17"/>
+              </w:rPr>
+              <w:t>9</w:t>
+            </w:r>
+          </w:p>
+        </w:tc>
+        <w:tc>
+          <w:tcPr>
+            <w:tcW w:type="dxa" w:w="3312"/>
+          </w:tcPr>
+          <w:p>
+            <w:r/>
+            <w:r>
+              <w:rPr>
+                <w:sz w:val="17"/>
+              </w:rPr>
+              <w:t>API section did not say why an API exists or which endpoints are additions.</w:t>
+            </w:r>
+          </w:p>
+        </w:tc>
+        <w:tc>
+          <w:tcPr>
+            <w:tcW w:type="dxa" w:w="3312"/>
+          </w:tcPr>
+          <w:p>
+            <w:r/>
+            <w:r>
+              <w:rPr>
+                <w:sz w:val="17"/>
+              </w:rPr>
+              <w:t>§9 now cites NFR-002 ("endpoints") and marks endpoints 10 and 12 as the only design additions.</w:t>
+            </w:r>
+          </w:p>
+        </w:tc>
+      </w:tr>
+      <w:tr>
+        <w:tc>
+          <w:tcPr>
+            <w:tcW w:type="dxa" w:w="3312"/>
+          </w:tcPr>
+          <w:p>
+            <w:r/>
+            <w:r>
+              <w:rPr>
+                <w:sz w:val="17"/>
+              </w:rPr>
+              <w:t>10</w:t>
+            </w:r>
+          </w:p>
+        </w:tc>
+        <w:tc>
+          <w:tcPr>
+            <w:tcW w:type="dxa" w:w="3312"/>
+          </w:tcPr>
+          <w:p>
+            <w:r/>
+            <w:r>
+              <w:rPr>
+                <w:sz w:val="17"/>
+              </w:rPr>
+              <w:t xml:space="preserve">Component diagram: the </w:t>
+            </w:r>
+            <w:r>
+              <w:rPr>
+                <w:i/>
+                <w:sz w:val="17"/>
+              </w:rPr>
+              <w:t>ILog</w:t>
+            </w:r>
+            <w:r>
+              <w:rPr>
+                <w:sz w:val="17"/>
+              </w:rPr>
+              <w:t xml:space="preserve"> arrow from the services package suggested all four services log, while the table says three.</w:t>
+            </w:r>
+          </w:p>
+        </w:tc>
+        <w:tc>
+          <w:tcPr>
+            <w:tcW w:type="dxa" w:w="3312"/>
+          </w:tcPr>
+          <w:p>
+            <w:r/>
+            <w:r>
+              <w:rPr>
+                <w:sz w:val="17"/>
+              </w:rPr>
+              <w:t>Caption and §4.2 now state exactly which components use each interface.</w:t>
+            </w:r>
+          </w:p>
+        </w:tc>
+      </w:tr>
+      <w:tr>
+        <w:tc>
+          <w:tcPr>
+            <w:tcW w:type="dxa" w:w="3312"/>
+          </w:tcPr>
+          <w:p>
+            <w:r/>
+            <w:r>
+              <w:rPr>
+                <w:sz w:val="17"/>
+              </w:rPr>
+              <w:t>11</w:t>
+            </w:r>
+          </w:p>
+        </w:tc>
+        <w:tc>
+          <w:tcPr>
+            <w:tcW w:type="dxa" w:w="3312"/>
+          </w:tcPr>
+          <w:p>
+            <w:r/>
+            <w:r>
+              <w:rPr>
+                <w:sz w:val="17"/>
+              </w:rPr>
+              <w:t>Diagram text was too small when printed (sequence diagram with 8 participants on a portrait page).</w:t>
+            </w:r>
+          </w:p>
+        </w:tc>
+        <w:tc>
+          <w:tcPr>
+            <w:tcW w:type="dxa" w:w="3312"/>
+          </w:tcPr>
+          <w:p>
+            <w:r/>
+            <w:r>
+              <w:rPr>
+                <w:sz w:val="17"/>
+              </w:rPr>
+              <w:t>UC-03 split into two readable parts (SD-01 part 1 / part 2); all figures are on landscape pages with larger fonts.</w:t>
+            </w:r>
+          </w:p>
+        </w:tc>
+      </w:tr>
+      <w:tr>
+        <w:tc>
+          <w:tcPr>
+            <w:tcW w:type="dxa" w:w="3312"/>
+          </w:tcPr>
+          <w:p>
+            <w:r/>
+            <w:r>
+              <w:rPr>
+                <w:sz w:val="17"/>
+              </w:rPr>
+              <w:t>12</w:t>
+            </w:r>
+          </w:p>
+        </w:tc>
+        <w:tc>
+          <w:tcPr>
+            <w:tcW w:type="dxa" w:w="3312"/>
+          </w:tcPr>
+          <w:p>
+            <w:r/>
+            <w:r>
+              <w:rPr>
+                <w:sz w:val="17"/>
+              </w:rPr>
+              <w:t>Authorization-path arrow crossed another arrow in the component diagram.</w:t>
+            </w:r>
+          </w:p>
+        </w:tc>
+        <w:tc>
+          <w:tcPr>
+            <w:tcW w:type="dxa" w:w="3312"/>
+          </w:tcPr>
+          <w:p>
+            <w:r/>
+            <w:r>
+              <w:rPr>
+                <w:sz w:val="17"/>
+              </w:rPr>
+              <w:t>Re-routed.</w:t>
+            </w:r>
+          </w:p>
+        </w:tc>
+      </w:tr>
+    </w:tbl>
+    <w:p/>
     <w:sectPr>
       <w:pgSz w:w="12240" w:h="15840"/>
       <w:pgMar w:top="1152" w:right="1152" w:bottom="1152" w:left="1152" w:header="720" w:footer="720" w:gutter="0"/>

</xml_diff>

<commit_message>
Fix PDF/DOCX layout defects and connect draw.io arrows
- Remove empty header row from info tables; fix SEC requirements table
- Put headings on the same landscape page as their figure
- Let long tables break across pages; larger figures
- Attach arrows to shapes in use-case and component .drawio files
- Log the fixes in Gap_Analysis section 5

Co-Authored-By: Claude Sonnet 5.5 <noreply@anthropic.com>
</commit_message>
<xml_diff>
--- a/docs/output/Gap_Analysis.docx
+++ b/docs/output/Gap_Analysis.docx
@@ -1996,6 +1996,120 @@
           </w:p>
         </w:tc>
       </w:tr>
+      <w:tr>
+        <w:tc>
+          <w:tcPr>
+            <w:tcW w:type="dxa" w:w="3312"/>
+          </w:tcPr>
+          <w:p>
+            <w:r/>
+            <w:r>
+              <w:rPr>
+                <w:sz w:val="17"/>
+              </w:rPr>
+              <w:t>13</w:t>
+            </w:r>
+          </w:p>
+        </w:tc>
+        <w:tc>
+          <w:tcPr>
+            <w:tcW w:type="dxa" w:w="3312"/>
+          </w:tcPr>
+          <w:p>
+            <w:r/>
+            <w:r>
+              <w:rPr>
+                <w:sz w:val="17"/>
+              </w:rPr>
+              <w:t>PDF/DOCX defects found on a page-by-page read: empty shaded first row in the document-info tables, the SRS security table rendered as raw text, headings stranded before landscape figures, figures printed small, a stray control character before a figure.</w:t>
+            </w:r>
+          </w:p>
+        </w:tc>
+        <w:tc>
+          <w:tcPr>
+            <w:tcW w:type="dxa" w:w="3312"/>
+          </w:tcPr>
+          <w:p>
+            <w:r/>
+            <w:r>
+              <w:rPr>
+                <w:sz w:val="17"/>
+              </w:rPr>
+              <w:t xml:space="preserve">Fixed in the SRS table markup and in </w:t>
+            </w:r>
+            <w:r>
+              <w:rPr>
+                <w:rFonts w:ascii="Consolas" w:hAnsi="Consolas"/>
+                <w:sz w:val="17"/>
+              </w:rPr>
+              <w:t>build_docs.py</w:t>
+            </w:r>
+            <w:r>
+              <w:rPr>
+                <w:sz w:val="17"/>
+              </w:rPr>
+              <w:t>; headings now sit on the same landscape page as their figure; PDFs and DOCX rebuilt and re-checked (no raw Markdown, no near-empty pages except one section-lead page).</w:t>
+            </w:r>
+          </w:p>
+        </w:tc>
+      </w:tr>
+      <w:tr>
+        <w:tc>
+          <w:tcPr>
+            <w:tcW w:type="dxa" w:w="3312"/>
+          </w:tcPr>
+          <w:p>
+            <w:r/>
+            <w:r>
+              <w:rPr>
+                <w:sz w:val="17"/>
+              </w:rPr>
+              <w:t>14</w:t>
+            </w:r>
+          </w:p>
+        </w:tc>
+        <w:tc>
+          <w:tcPr>
+            <w:tcW w:type="dxa" w:w="3312"/>
+          </w:tcPr>
+          <w:p>
+            <w:r/>
+            <w:r>
+              <w:rPr>
+                <w:sz w:val="17"/>
+              </w:rPr>
+              <w:t>draw.io files had unconnected arrows.</w:t>
+            </w:r>
+          </w:p>
+        </w:tc>
+        <w:tc>
+          <w:tcPr>
+            <w:tcW w:type="dxa" w:w="3312"/>
+          </w:tcPr>
+          <w:p>
+            <w:r/>
+            <w:r>
+              <w:rPr>
+                <w:sz w:val="17"/>
+              </w:rPr>
+              <w:t xml:space="preserve">In the use-case and component </w:t>
+            </w:r>
+            <w:r>
+              <w:rPr>
+                <w:rFonts w:ascii="Consolas" w:hAnsi="Consolas"/>
+                <w:sz w:val="17"/>
+              </w:rPr>
+              <w:t>.drawio</w:t>
+            </w:r>
+            <w:r>
+              <w:rPr>
+                <w:sz w:val="17"/>
+              </w:rPr>
+              <w:t xml:space="preserve"> files, arrows whose ends touch a shape are now attached to it (verified by re-rendering in draw.io). Sequence diagrams keep free-standing message arrows.</w:t>
+            </w:r>
+          </w:p>
+        </w:tc>
+      </w:tr>
     </w:tbl>
     <w:p/>
     <w:sectPr>

</xml_diff>